<commit_message>
Makale ve rapor güncellendi
</commit_message>
<xml_diff>
--- a/docs/tarimzeka_bilimsel_makale_taslagi.docx
+++ b/docs/tarimzeka_bilimsel_makale_taslagi.docx
@@ -39,56 +39,173 @@
       <w:pPr>
         <w:spacing w:after="220" w:line="276" w:lineRule="auto"/>
         <w:jc w:val="center"/>
-      </w:pPr>
-      <w:r>
         <w:rPr>
           <w:color w:val="64748B"/>
           <w:sz w:val="20"/>
         </w:rPr>
-        <w:t>Yazar(</w:t>
-      </w:r>
-      <w:proofErr w:type="spellStart"/>
+      </w:pPr>
       <w:r>
         <w:rPr>
           <w:color w:val="64748B"/>
           <w:sz w:val="20"/>
         </w:rPr>
-        <w:t>lar</w:t>
-      </w:r>
-      <w:proofErr w:type="spellEnd"/>
+        <w:t>Yazarlar: [</w:t>
+      </w:r>
       <w:r>
         <w:rPr>
           <w:color w:val="64748B"/>
           <w:sz w:val="20"/>
         </w:rPr>
-        <w:t xml:space="preserve">): [Ad </w:t>
-      </w:r>
-      <w:proofErr w:type="spellStart"/>
+        <w:t>Ali SUNTUR, İlayda ÖZMEN</w:t>
+      </w:r>
       <w:r>
         <w:rPr>
           <w:color w:val="64748B"/>
           <w:sz w:val="20"/>
         </w:rPr>
-        <w:t>Soyad</w:t>
-      </w:r>
-      <w:proofErr w:type="spellEnd"/>
-      <w:r>
+        <w:t xml:space="preserve">] | </w:t>
+      </w:r>
+    </w:p>
+    <w:p>
+      <w:pPr>
+        <w:spacing w:after="220" w:line="276" w:lineRule="auto"/>
+        <w:jc w:val="center"/>
         <w:rPr>
           <w:color w:val="64748B"/>
           <w:sz w:val="20"/>
         </w:rPr>
-        <w:t>] | Kurum: [Kurum] | Taslak tarihi: 13 Nisan 2026</w:t>
-      </w:r>
+      </w:pPr>
+      <w:r>
+        <w:rPr>
+          <w:color w:val="64748B"/>
+          <w:sz w:val="20"/>
+        </w:rPr>
+        <w:t>Kurum: [</w:t>
+      </w:r>
+      <w:r>
+        <w:rPr>
+          <w:color w:val="64748B"/>
+          <w:sz w:val="20"/>
+        </w:rPr>
+        <w:t xml:space="preserve">Pamukkale Üniversitesi Yönetim Bilişim Sistemleri </w:t>
+      </w:r>
+      <w:proofErr w:type="gramStart"/>
+      <w:r>
+        <w:rPr>
+          <w:color w:val="64748B"/>
+          <w:sz w:val="20"/>
+        </w:rPr>
+        <w:t xml:space="preserve">Bölümü </w:t>
+      </w:r>
+      <w:r>
+        <w:rPr>
+          <w:color w:val="64748B"/>
+          <w:sz w:val="20"/>
+        </w:rPr>
+        <w:t>]</w:t>
+      </w:r>
+      <w:proofErr w:type="gramEnd"/>
+    </w:p>
+    <w:p>
+      <w:pPr>
+        <w:spacing w:after="220" w:line="276" w:lineRule="auto"/>
+        <w:jc w:val="center"/>
+        <w:rPr>
+          <w:color w:val="64748B"/>
+          <w:sz w:val="20"/>
+        </w:rPr>
+      </w:pPr>
+      <w:r>
+        <w:rPr>
+          <w:color w:val="64748B"/>
+          <w:sz w:val="20"/>
+        </w:rPr>
+        <w:t xml:space="preserve"> Taslak tarihi: 13 Nisan 2026</w:t>
+      </w:r>
+    </w:p>
+    <w:tbl>
+      <w:tblPr>
+        <w:tblStyle w:val="KlavuzTablo1Ak-Vurgu3"/>
+        <w:tblW w:w="0" w:type="auto"/>
+        <w:tblLook w:val="04A0" w:firstRow="1" w:lastRow="0" w:firstColumn="1" w:lastColumn="0" w:noHBand="0" w:noVBand="1"/>
+      </w:tblPr>
+      <w:tblGrid>
+        <w:gridCol w:w="9778"/>
+      </w:tblGrid>
+      <w:tr>
+        <w:trPr>
+          <w:cnfStyle w:val="100000000000" w:firstRow="1" w:lastRow="0" w:firstColumn="0" w:lastColumn="0" w:oddVBand="0" w:evenVBand="0" w:oddHBand="0" w:evenHBand="0" w:firstRowFirstColumn="0" w:firstRowLastColumn="0" w:lastRowFirstColumn="0" w:lastRowLastColumn="0"/>
+        </w:trPr>
+        <w:tc>
+          <w:tcPr>
+            <w:cnfStyle w:val="001000000000" w:firstRow="0" w:lastRow="0" w:firstColumn="1" w:lastColumn="0" w:oddVBand="0" w:evenVBand="0" w:oddHBand="0" w:evenHBand="0" w:firstRowFirstColumn="0" w:firstRowLastColumn="0" w:lastRowFirstColumn="0" w:lastRowLastColumn="0"/>
+            <w:tcW w:w="9778" w:type="dxa"/>
+          </w:tcPr>
+          <w:p>
+            <w:pPr>
+              <w:spacing w:after="40" w:line="276" w:lineRule="auto"/>
+              <w:jc w:val="center"/>
+            </w:pPr>
+            <w:r>
+              <w:rPr>
+                <w:color w:val="1B4332"/>
+              </w:rPr>
+              <w:t xml:space="preserve">Makalenin odak </w:t>
+            </w:r>
+            <w:proofErr w:type="gramStart"/>
+            <w:r>
+              <w:rPr>
+                <w:color w:val="1B4332"/>
+              </w:rPr>
+              <w:t>noktası ;</w:t>
+            </w:r>
+            <w:proofErr w:type="gramEnd"/>
+          </w:p>
+          <w:p>
+            <w:pPr>
+              <w:spacing w:after="220" w:line="276" w:lineRule="auto"/>
+              <w:jc w:val="center"/>
+              <w:rPr>
+                <w:color w:val="64748B"/>
+                <w:sz w:val="20"/>
+              </w:rPr>
+            </w:pPr>
+            <w:r>
+              <w:t xml:space="preserve">Bu taslak; üretim geçmişi, tüketim projeksiyonları, iklim göstergeleri ve </w:t>
+            </w:r>
+            <w:proofErr w:type="spellStart"/>
+            <w:r>
+              <w:t>XGBoost</w:t>
+            </w:r>
+            <w:proofErr w:type="spellEnd"/>
+            <w:r>
+              <w:t xml:space="preserve"> tabanlı üretim tahminlerini çiftçi odaklı bir karar destek sistemi içinde birleştiren uçtan uca mimariyi açıklar</w:t>
+            </w:r>
+          </w:p>
+        </w:tc>
+      </w:tr>
+    </w:tbl>
+    <w:p>
+      <w:pPr>
+        <w:spacing w:after="220" w:line="276" w:lineRule="auto"/>
+        <w:jc w:val="center"/>
+        <w:rPr>
+          <w:color w:val="64748B"/>
+          <w:sz w:val="20"/>
+        </w:rPr>
+      </w:pPr>
     </w:p>
     <w:tbl>
       <w:tblPr>
         <w:tblW w:w="9000" w:type="dxa"/>
-        <w:tblInd w:w="23" w:type="dxa"/>
+        <w:tblInd w:w="10" w:type="dxa"/>
         <w:tblBorders>
-          <w:top w:val="single" w:sz="4" w:space="0" w:color="D8F3DC"/>
-          <w:left w:val="single" w:sz="18" w:space="0" w:color="2D6A4F"/>
-          <w:bottom w:val="single" w:sz="4" w:space="0" w:color="D8F3DC"/>
-          <w:right w:val="single" w:sz="4" w:space="0" w:color="D8F3DC"/>
+          <w:top w:val="single" w:sz="6" w:space="0" w:color="D7DEE8"/>
+          <w:left w:val="single" w:sz="6" w:space="0" w:color="D7DEE8"/>
+          <w:bottom w:val="single" w:sz="6" w:space="0" w:color="D7DEE8"/>
+          <w:right w:val="single" w:sz="6" w:space="0" w:color="D7DEE8"/>
+          <w:insideH w:val="single" w:sz="6" w:space="0" w:color="D7DEE8"/>
+          <w:insideV w:val="single" w:sz="6" w:space="0" w:color="D7DEE8"/>
         </w:tblBorders>
         <w:tblCellMar>
           <w:left w:w="10" w:type="dxa"/>
@@ -97,69 +214,10 @@
         <w:tblLook w:val="04A0" w:firstRow="1" w:lastRow="0" w:firstColumn="1" w:lastColumn="0" w:noHBand="0" w:noVBand="1"/>
       </w:tblPr>
       <w:tblGrid>
-        <w:gridCol w:w="5842"/>
-        <w:gridCol w:w="3158"/>
+        <w:gridCol w:w="1423"/>
+        <w:gridCol w:w="7577"/>
       </w:tblGrid>
       <w:tr>
-        <w:tblPrEx>
-          <w:tblCellMar>
-            <w:top w:w="0" w:type="dxa"/>
-            <w:bottom w:w="0" w:type="dxa"/>
-          </w:tblCellMar>
-        </w:tblPrEx>
-        <w:trPr>
-          <w:gridAfter w:val="1"/>
-        </w:trPr>
-        <w:tc>
-          <w:tcPr>
-            <w:tcW w:w="0" w:type="auto"/>
-            <w:shd w:val="clear" w:color="auto" w:fill="EFFAF2"/>
-          </w:tcPr>
-          <w:p>
-            <w:pPr>
-              <w:spacing w:after="40" w:line="276" w:lineRule="auto"/>
-            </w:pPr>
-            <w:r>
-              <w:rPr>
-                <w:b/>
-                <w:color w:val="1B4332"/>
-              </w:rPr>
-              <w:t>Makalenin odak katkısı</w:t>
-            </w:r>
-          </w:p>
-          <w:p>
-            <w:pPr>
-              <w:spacing w:after="40" w:line="276" w:lineRule="auto"/>
-            </w:pPr>
-            <w:r>
-              <w:t xml:space="preserve">Bu taslak; üretim geçmişi, tüketim projeksiyonları, iklim göstergeleri ve </w:t>
-            </w:r>
-            <w:proofErr w:type="spellStart"/>
-            <w:r>
-              <w:t>XGBoost</w:t>
-            </w:r>
-            <w:proofErr w:type="spellEnd"/>
-            <w:r>
-              <w:t xml:space="preserve"> tabanlı üretim tahminlerini çiftçi odaklı bir karar destek sistemi içinde birleştiren uçtan uca mimariyi akademik makale formatında sunar.</w:t>
-            </w:r>
-          </w:p>
-        </w:tc>
-      </w:tr>
-      <w:tr>
-        <w:tblPrEx>
-          <w:tblBorders>
-            <w:top w:val="single" w:sz="6" w:space="0" w:color="D7DEE8"/>
-            <w:left w:val="single" w:sz="6" w:space="0" w:color="D7DEE8"/>
-            <w:bottom w:val="single" w:sz="6" w:space="0" w:color="D7DEE8"/>
-            <w:right w:val="single" w:sz="6" w:space="0" w:color="D7DEE8"/>
-            <w:insideH w:val="single" w:sz="6" w:space="0" w:color="D7DEE8"/>
-            <w:insideV w:val="single" w:sz="6" w:space="0" w:color="D7DEE8"/>
-          </w:tblBorders>
-          <w:tblCellMar>
-            <w:top w:w="0" w:type="dxa"/>
-            <w:bottom w:w="0" w:type="dxa"/>
-          </w:tblCellMar>
-        </w:tblPrEx>
         <w:tc>
           <w:tcPr>
             <w:tcW w:w="0" w:type="auto"/>
@@ -200,20 +258,6 @@
         </w:tc>
       </w:tr>
       <w:tr>
-        <w:tblPrEx>
-          <w:tblBorders>
-            <w:top w:val="single" w:sz="6" w:space="0" w:color="D7DEE8"/>
-            <w:left w:val="single" w:sz="6" w:space="0" w:color="D7DEE8"/>
-            <w:bottom w:val="single" w:sz="6" w:space="0" w:color="D7DEE8"/>
-            <w:right w:val="single" w:sz="6" w:space="0" w:color="D7DEE8"/>
-            <w:insideH w:val="single" w:sz="6" w:space="0" w:color="D7DEE8"/>
-            <w:insideV w:val="single" w:sz="6" w:space="0" w:color="D7DEE8"/>
-          </w:tblBorders>
-          <w:tblCellMar>
-            <w:top w:w="0" w:type="dxa"/>
-            <w:bottom w:w="0" w:type="dxa"/>
-          </w:tblCellMar>
-        </w:tblPrEx>
         <w:tc>
           <w:tcPr>
             <w:tcW w:w="0" w:type="auto"/>
@@ -244,20 +288,6 @@
         </w:tc>
       </w:tr>
       <w:tr>
-        <w:tblPrEx>
-          <w:tblBorders>
-            <w:top w:val="single" w:sz="6" w:space="0" w:color="D7DEE8"/>
-            <w:left w:val="single" w:sz="6" w:space="0" w:color="D7DEE8"/>
-            <w:bottom w:val="single" w:sz="6" w:space="0" w:color="D7DEE8"/>
-            <w:right w:val="single" w:sz="6" w:space="0" w:color="D7DEE8"/>
-            <w:insideH w:val="single" w:sz="6" w:space="0" w:color="D7DEE8"/>
-            <w:insideV w:val="single" w:sz="6" w:space="0" w:color="D7DEE8"/>
-          </w:tblBorders>
-          <w:tblCellMar>
-            <w:top w:w="0" w:type="dxa"/>
-            <w:bottom w:w="0" w:type="dxa"/>
-          </w:tblCellMar>
-        </w:tblPrEx>
         <w:tc>
           <w:tcPr>
             <w:tcW w:w="0" w:type="auto"/>
@@ -290,20 +320,6 @@
         </w:tc>
       </w:tr>
       <w:tr>
-        <w:tblPrEx>
-          <w:tblBorders>
-            <w:top w:val="single" w:sz="6" w:space="0" w:color="D7DEE8"/>
-            <w:left w:val="single" w:sz="6" w:space="0" w:color="D7DEE8"/>
-            <w:bottom w:val="single" w:sz="6" w:space="0" w:color="D7DEE8"/>
-            <w:right w:val="single" w:sz="6" w:space="0" w:color="D7DEE8"/>
-            <w:insideH w:val="single" w:sz="6" w:space="0" w:color="D7DEE8"/>
-            <w:insideV w:val="single" w:sz="6" w:space="0" w:color="D7DEE8"/>
-          </w:tblBorders>
-          <w:tblCellMar>
-            <w:top w:w="0" w:type="dxa"/>
-            <w:bottom w:w="0" w:type="dxa"/>
-          </w:tblCellMar>
-        </w:tblPrEx>
         <w:tc>
           <w:tcPr>
             <w:tcW w:w="0" w:type="auto"/>
@@ -379,20 +395,6 @@
         </w:tc>
       </w:tr>
       <w:tr>
-        <w:tblPrEx>
-          <w:tblBorders>
-            <w:top w:val="single" w:sz="6" w:space="0" w:color="D7DEE8"/>
-            <w:left w:val="single" w:sz="6" w:space="0" w:color="D7DEE8"/>
-            <w:bottom w:val="single" w:sz="6" w:space="0" w:color="D7DEE8"/>
-            <w:right w:val="single" w:sz="6" w:space="0" w:color="D7DEE8"/>
-            <w:insideH w:val="single" w:sz="6" w:space="0" w:color="D7DEE8"/>
-            <w:insideV w:val="single" w:sz="6" w:space="0" w:color="D7DEE8"/>
-          </w:tblBorders>
-          <w:tblCellMar>
-            <w:top w:w="0" w:type="dxa"/>
-            <w:bottom w:w="0" w:type="dxa"/>
-          </w:tblCellMar>
-        </w:tblPrEx>
         <w:tc>
           <w:tcPr>
             <w:tcW w:w="0" w:type="auto"/>
@@ -493,128 +495,137 @@
     <w:p>
       <w:pPr>
         <w:spacing w:after="120" w:line="276" w:lineRule="auto"/>
-      </w:pPr>
-      <w:r>
         <w:rPr>
           <w:b/>
           <w:color w:val="1B4332"/>
         </w:rPr>
-        <w:t xml:space="preserve">Anahtar Kelimeler: tarımsal üretim planlaması; karar destek </w:t>
-      </w:r>
-      <w:proofErr w:type="gramStart"/>
+      </w:pPr>
       <w:r>
         <w:rPr>
           <w:b/>
           <w:color w:val="1B4332"/>
         </w:rPr>
-        <w:t>sistemi;</w:t>
-      </w:r>
-      <w:proofErr w:type="gramEnd"/>
+        <w:t xml:space="preserve">Anahtar Kelimeler: tarımsal üretim planlaması; karar destek </w:t>
+      </w:r>
+      <w:proofErr w:type="gramStart"/>
       <w:r>
         <w:rPr>
           <w:b/>
           <w:color w:val="1B4332"/>
         </w:rPr>
-        <w:t xml:space="preserve"> </w:t>
-      </w:r>
-      <w:proofErr w:type="spellStart"/>
-      <w:proofErr w:type="gramStart"/>
+        <w:t>sistemi;</w:t>
+      </w:r>
+      <w:proofErr w:type="gramEnd"/>
       <w:r>
         <w:rPr>
           <w:b/>
           <w:color w:val="1B4332"/>
         </w:rPr>
-        <w:t>XGBoost</w:t>
-      </w:r>
-      <w:proofErr w:type="spellEnd"/>
+        <w:t xml:space="preserve"> </w:t>
+      </w:r>
+      <w:proofErr w:type="spellStart"/>
+      <w:proofErr w:type="gramStart"/>
       <w:r>
         <w:rPr>
           <w:b/>
           <w:color w:val="1B4332"/>
         </w:rPr>
-        <w:t>;</w:t>
-      </w:r>
-      <w:proofErr w:type="gramEnd"/>
+        <w:t>XGBoost</w:t>
+      </w:r>
+      <w:proofErr w:type="spellEnd"/>
       <w:r>
         <w:rPr>
           <w:b/>
           <w:color w:val="1B4332"/>
         </w:rPr>
-        <w:t xml:space="preserve"> </w:t>
-      </w:r>
-      <w:proofErr w:type="gramStart"/>
+        <w:t>;</w:t>
+      </w:r>
+      <w:proofErr w:type="gramEnd"/>
       <w:r>
         <w:rPr>
           <w:b/>
           <w:color w:val="1B4332"/>
         </w:rPr>
-        <w:t>AHP;</w:t>
-      </w:r>
-      <w:proofErr w:type="gramEnd"/>
+        <w:t xml:space="preserve"> </w:t>
+      </w:r>
+      <w:proofErr w:type="gramStart"/>
       <w:r>
         <w:rPr>
           <w:b/>
           <w:color w:val="1B4332"/>
         </w:rPr>
-        <w:t xml:space="preserve"> arz-talep dengesi; iklim </w:t>
-      </w:r>
-      <w:proofErr w:type="gramStart"/>
+        <w:t>AHP;</w:t>
+      </w:r>
+      <w:proofErr w:type="gramEnd"/>
       <w:r>
         <w:rPr>
           <w:b/>
           <w:color w:val="1B4332"/>
         </w:rPr>
-        <w:t>riski;</w:t>
-      </w:r>
-      <w:proofErr w:type="gramEnd"/>
+        <w:t xml:space="preserve"> arz-talep dengesi; iklim </w:t>
+      </w:r>
+      <w:proofErr w:type="gramStart"/>
       <w:r>
         <w:rPr>
           <w:b/>
           <w:color w:val="1B4332"/>
         </w:rPr>
-        <w:t xml:space="preserve"> </w:t>
-      </w:r>
-      <w:proofErr w:type="spellStart"/>
-      <w:proofErr w:type="gramStart"/>
+        <w:t>riski;</w:t>
+      </w:r>
+      <w:proofErr w:type="gramEnd"/>
       <w:r>
         <w:rPr>
           <w:b/>
           <w:color w:val="1B4332"/>
         </w:rPr>
-        <w:t>React</w:t>
-      </w:r>
-      <w:proofErr w:type="spellEnd"/>
+        <w:t xml:space="preserve"> </w:t>
+      </w:r>
+      <w:proofErr w:type="spellStart"/>
+      <w:proofErr w:type="gramStart"/>
       <w:r>
         <w:rPr>
           <w:b/>
           <w:color w:val="1B4332"/>
         </w:rPr>
-        <w:t>;</w:t>
-      </w:r>
-      <w:proofErr w:type="gramEnd"/>
+        <w:t>React</w:t>
+      </w:r>
+      <w:proofErr w:type="spellEnd"/>
       <w:r>
         <w:rPr>
           <w:b/>
           <w:color w:val="1B4332"/>
         </w:rPr>
-        <w:t xml:space="preserve"> </w:t>
-      </w:r>
-      <w:proofErr w:type="spellStart"/>
+        <w:t>;</w:t>
+      </w:r>
+      <w:proofErr w:type="gramEnd"/>
       <w:r>
         <w:rPr>
           <w:b/>
           <w:color w:val="1B4332"/>
         </w:rPr>
-        <w:t>FastAPI</w:t>
-      </w:r>
-      <w:proofErr w:type="spellEnd"/>
+        <w:t xml:space="preserve"> </w:t>
+      </w:r>
+      <w:proofErr w:type="spellStart"/>
       <w:r>
         <w:rPr>
           <w:b/>
           <w:color w:val="1B4332"/>
         </w:rPr>
+        <w:t>FastAPI</w:t>
+      </w:r>
+      <w:proofErr w:type="spellEnd"/>
+      <w:r>
+        <w:rPr>
+          <w:b/>
+          <w:color w:val="1B4332"/>
+        </w:rPr>
         <w:t>.</w:t>
       </w:r>
+    </w:p>
+    <w:p>
+      <w:pPr>
+        <w:spacing w:after="120" w:line="276" w:lineRule="auto"/>
+      </w:pPr>
     </w:p>
     <w:p>
       <w:pPr>
@@ -1461,12 +1472,6 @@
         <w:gridCol w:w="9000"/>
       </w:tblGrid>
       <w:tr>
-        <w:tblPrEx>
-          <w:tblCellMar>
-            <w:top w:w="0" w:type="dxa"/>
-            <w:bottom w:w="0" w:type="dxa"/>
-          </w:tblCellMar>
-        </w:tblPrEx>
         <w:tc>
           <w:tcPr>
             <w:tcW w:w="0" w:type="auto"/>
@@ -1545,12 +1550,6 @@
         <w:gridCol w:w="3938"/>
       </w:tblGrid>
       <w:tr>
-        <w:tblPrEx>
-          <w:tblCellMar>
-            <w:top w:w="0" w:type="dxa"/>
-            <w:bottom w:w="0" w:type="dxa"/>
-          </w:tblCellMar>
-        </w:tblPrEx>
         <w:tc>
           <w:tcPr>
             <w:tcW w:w="0" w:type="auto"/>
@@ -1629,12 +1628,6 @@
         </w:tc>
       </w:tr>
       <w:tr>
-        <w:tblPrEx>
-          <w:tblCellMar>
-            <w:top w:w="0" w:type="dxa"/>
-            <w:bottom w:w="0" w:type="dxa"/>
-          </w:tblCellMar>
-        </w:tblPrEx>
         <w:tc>
           <w:tcPr>
             <w:tcW w:w="0" w:type="auto"/>
@@ -1693,12 +1686,6 @@
         </w:tc>
       </w:tr>
       <w:tr>
-        <w:tblPrEx>
-          <w:tblCellMar>
-            <w:top w:w="0" w:type="dxa"/>
-            <w:bottom w:w="0" w:type="dxa"/>
-          </w:tblCellMar>
-        </w:tblPrEx>
         <w:tc>
           <w:tcPr>
             <w:tcW w:w="0" w:type="auto"/>
@@ -1761,12 +1748,6 @@
         </w:tc>
       </w:tr>
       <w:tr>
-        <w:tblPrEx>
-          <w:tblCellMar>
-            <w:top w:w="0" w:type="dxa"/>
-            <w:bottom w:w="0" w:type="dxa"/>
-          </w:tblCellMar>
-        </w:tblPrEx>
         <w:tc>
           <w:tcPr>
             <w:tcW w:w="0" w:type="auto"/>
@@ -1825,12 +1806,6 @@
         </w:tc>
       </w:tr>
       <w:tr>
-        <w:tblPrEx>
-          <w:tblCellMar>
-            <w:top w:w="0" w:type="dxa"/>
-            <w:bottom w:w="0" w:type="dxa"/>
-          </w:tblCellMar>
-        </w:tblPrEx>
         <w:tc>
           <w:tcPr>
             <w:tcW w:w="0" w:type="auto"/>
@@ -1901,12 +1876,6 @@
         </w:tc>
       </w:tr>
       <w:tr>
-        <w:tblPrEx>
-          <w:tblCellMar>
-            <w:top w:w="0" w:type="dxa"/>
-            <w:bottom w:w="0" w:type="dxa"/>
-          </w:tblCellMar>
-        </w:tblPrEx>
         <w:tc>
           <w:tcPr>
             <w:tcW w:w="0" w:type="auto"/>
@@ -1981,12 +1950,6 @@
         </w:tc>
       </w:tr>
       <w:tr>
-        <w:tblPrEx>
-          <w:tblCellMar>
-            <w:top w:w="0" w:type="dxa"/>
-            <w:bottom w:w="0" w:type="dxa"/>
-          </w:tblCellMar>
-        </w:tblPrEx>
         <w:tc>
           <w:tcPr>
             <w:tcW w:w="0" w:type="auto"/>
@@ -2210,12 +2173,6 @@
         <w:gridCol w:w="735"/>
       </w:tblGrid>
       <w:tr>
-        <w:tblPrEx>
-          <w:tblCellMar>
-            <w:top w:w="0" w:type="dxa"/>
-            <w:bottom w:w="0" w:type="dxa"/>
-          </w:tblCellMar>
-        </w:tblPrEx>
         <w:tc>
           <w:tcPr>
             <w:tcW w:w="0" w:type="auto"/>
@@ -2332,12 +2289,6 @@
         </w:tc>
       </w:tr>
       <w:tr>
-        <w:tblPrEx>
-          <w:tblCellMar>
-            <w:top w:w="0" w:type="dxa"/>
-            <w:bottom w:w="0" w:type="dxa"/>
-          </w:tblCellMar>
-        </w:tblPrEx>
         <w:tc>
           <w:tcPr>
             <w:tcW w:w="0" w:type="auto"/>
@@ -2424,12 +2375,6 @@
         </w:tc>
       </w:tr>
       <w:tr>
-        <w:tblPrEx>
-          <w:tblCellMar>
-            <w:top w:w="0" w:type="dxa"/>
-            <w:bottom w:w="0" w:type="dxa"/>
-          </w:tblCellMar>
-        </w:tblPrEx>
         <w:tc>
           <w:tcPr>
             <w:tcW w:w="0" w:type="auto"/>
@@ -2522,12 +2467,6 @@
         </w:tc>
       </w:tr>
       <w:tr>
-        <w:tblPrEx>
-          <w:tblCellMar>
-            <w:top w:w="0" w:type="dxa"/>
-            <w:bottom w:w="0" w:type="dxa"/>
-          </w:tblCellMar>
-        </w:tblPrEx>
         <w:tc>
           <w:tcPr>
             <w:tcW w:w="0" w:type="auto"/>
@@ -2614,12 +2553,6 @@
         </w:tc>
       </w:tr>
       <w:tr>
-        <w:tblPrEx>
-          <w:tblCellMar>
-            <w:top w:w="0" w:type="dxa"/>
-            <w:bottom w:w="0" w:type="dxa"/>
-          </w:tblCellMar>
-        </w:tblPrEx>
         <w:tc>
           <w:tcPr>
             <w:tcW w:w="0" w:type="auto"/>
@@ -2869,12 +2802,6 @@
         <w:gridCol w:w="2486"/>
       </w:tblGrid>
       <w:tr>
-        <w:tblPrEx>
-          <w:tblCellMar>
-            <w:top w:w="0" w:type="dxa"/>
-            <w:bottom w:w="0" w:type="dxa"/>
-          </w:tblCellMar>
-        </w:tblPrEx>
         <w:tc>
           <w:tcPr>
             <w:tcW w:w="0" w:type="auto"/>
@@ -2934,12 +2861,6 @@
         </w:tc>
       </w:tr>
       <w:tr>
-        <w:tblPrEx>
-          <w:tblCellMar>
-            <w:top w:w="0" w:type="dxa"/>
-            <w:bottom w:w="0" w:type="dxa"/>
-          </w:tblCellMar>
-        </w:tblPrEx>
         <w:tc>
           <w:tcPr>
             <w:tcW w:w="0" w:type="auto"/>
@@ -2984,12 +2905,6 @@
         </w:tc>
       </w:tr>
       <w:tr>
-        <w:tblPrEx>
-          <w:tblCellMar>
-            <w:top w:w="0" w:type="dxa"/>
-            <w:bottom w:w="0" w:type="dxa"/>
-          </w:tblCellMar>
-        </w:tblPrEx>
         <w:tc>
           <w:tcPr>
             <w:tcW w:w="0" w:type="auto"/>
@@ -3037,12 +2952,6 @@
         </w:tc>
       </w:tr>
       <w:tr>
-        <w:tblPrEx>
-          <w:tblCellMar>
-            <w:top w:w="0" w:type="dxa"/>
-            <w:bottom w:w="0" w:type="dxa"/>
-          </w:tblCellMar>
-        </w:tblPrEx>
         <w:tc>
           <w:tcPr>
             <w:tcW w:w="0" w:type="auto"/>
@@ -3087,12 +2996,6 @@
         </w:tc>
       </w:tr>
       <w:tr>
-        <w:tblPrEx>
-          <w:tblCellMar>
-            <w:top w:w="0" w:type="dxa"/>
-            <w:bottom w:w="0" w:type="dxa"/>
-          </w:tblCellMar>
-        </w:tblPrEx>
         <w:tc>
           <w:tcPr>
             <w:tcW w:w="0" w:type="auto"/>
@@ -3149,10 +3052,6 @@
             <w:insideH w:val="none" w:sz="0" w:space="0" w:color="auto"/>
             <w:insideV w:val="none" w:sz="0" w:space="0" w:color="auto"/>
           </w:tblBorders>
-          <w:tblCellMar>
-            <w:top w:w="0" w:type="dxa"/>
-            <w:bottom w:w="0" w:type="dxa"/>
-          </w:tblCellMar>
         </w:tblPrEx>
         <w:trPr>
           <w:gridAfter w:val="2"/>
@@ -3258,12 +3157,6 @@
         <w:gridCol w:w="5629"/>
       </w:tblGrid>
       <w:tr>
-        <w:tblPrEx>
-          <w:tblCellMar>
-            <w:top w:w="0" w:type="dxa"/>
-            <w:bottom w:w="0" w:type="dxa"/>
-          </w:tblCellMar>
-        </w:tblPrEx>
         <w:tc>
           <w:tcPr>
             <w:tcW w:w="0" w:type="auto"/>
@@ -3323,12 +3216,6 @@
         </w:tc>
       </w:tr>
       <w:tr>
-        <w:tblPrEx>
-          <w:tblCellMar>
-            <w:top w:w="0" w:type="dxa"/>
-            <w:bottom w:w="0" w:type="dxa"/>
-          </w:tblCellMar>
-        </w:tblPrEx>
         <w:tc>
           <w:tcPr>
             <w:tcW w:w="0" w:type="auto"/>
@@ -3401,12 +3288,6 @@
         </w:tc>
       </w:tr>
       <w:tr>
-        <w:tblPrEx>
-          <w:tblCellMar>
-            <w:top w:w="0" w:type="dxa"/>
-            <w:bottom w:w="0" w:type="dxa"/>
-          </w:tblCellMar>
-        </w:tblPrEx>
         <w:tc>
           <w:tcPr>
             <w:tcW w:w="0" w:type="auto"/>
@@ -3477,12 +3358,6 @@
         </w:tc>
       </w:tr>
       <w:tr>
-        <w:tblPrEx>
-          <w:tblCellMar>
-            <w:top w:w="0" w:type="dxa"/>
-            <w:bottom w:w="0" w:type="dxa"/>
-          </w:tblCellMar>
-        </w:tblPrEx>
         <w:tc>
           <w:tcPr>
             <w:tcW w:w="0" w:type="auto"/>
@@ -3563,12 +3438,6 @@
         </w:tc>
       </w:tr>
       <w:tr>
-        <w:tblPrEx>
-          <w:tblCellMar>
-            <w:top w:w="0" w:type="dxa"/>
-            <w:bottom w:w="0" w:type="dxa"/>
-          </w:tblCellMar>
-        </w:tblPrEx>
         <w:tc>
           <w:tcPr>
             <w:tcW w:w="0" w:type="auto"/>
@@ -3629,12 +3498,6 @@
         </w:tc>
       </w:tr>
       <w:tr>
-        <w:tblPrEx>
-          <w:tblCellMar>
-            <w:top w:w="0" w:type="dxa"/>
-            <w:bottom w:w="0" w:type="dxa"/>
-          </w:tblCellMar>
-        </w:tblPrEx>
         <w:tc>
           <w:tcPr>
             <w:tcW w:w="0" w:type="auto"/>
@@ -3890,12 +3753,6 @@
         <w:gridCol w:w="3865"/>
       </w:tblGrid>
       <w:tr>
-        <w:tblPrEx>
-          <w:tblCellMar>
-            <w:top w:w="0" w:type="dxa"/>
-            <w:bottom w:w="0" w:type="dxa"/>
-          </w:tblCellMar>
-        </w:tblPrEx>
         <w:tc>
           <w:tcPr>
             <w:tcW w:w="0" w:type="auto"/>
@@ -3955,12 +3812,6 @@
         </w:tc>
       </w:tr>
       <w:tr>
-        <w:tblPrEx>
-          <w:tblCellMar>
-            <w:top w:w="0" w:type="dxa"/>
-            <w:bottom w:w="0" w:type="dxa"/>
-          </w:tblCellMar>
-        </w:tblPrEx>
         <w:tc>
           <w:tcPr>
             <w:tcW w:w="0" w:type="auto"/>
@@ -4015,12 +3866,6 @@
         </w:tc>
       </w:tr>
       <w:tr>
-        <w:tblPrEx>
-          <w:tblCellMar>
-            <w:top w:w="0" w:type="dxa"/>
-            <w:bottom w:w="0" w:type="dxa"/>
-          </w:tblCellMar>
-        </w:tblPrEx>
         <w:tc>
           <w:tcPr>
             <w:tcW w:w="0" w:type="auto"/>
@@ -4068,12 +3913,6 @@
         </w:tc>
       </w:tr>
       <w:tr>
-        <w:tblPrEx>
-          <w:tblCellMar>
-            <w:top w:w="0" w:type="dxa"/>
-            <w:bottom w:w="0" w:type="dxa"/>
-          </w:tblCellMar>
-        </w:tblPrEx>
         <w:tc>
           <w:tcPr>
             <w:tcW w:w="0" w:type="auto"/>
@@ -4118,12 +3957,6 @@
         </w:tc>
       </w:tr>
       <w:tr>
-        <w:tblPrEx>
-          <w:tblCellMar>
-            <w:top w:w="0" w:type="dxa"/>
-            <w:bottom w:w="0" w:type="dxa"/>
-          </w:tblCellMar>
-        </w:tblPrEx>
         <w:tc>
           <w:tcPr>
             <w:tcW w:w="0" w:type="auto"/>
@@ -4179,12 +4012,6 @@
         </w:tc>
       </w:tr>
       <w:tr>
-        <w:tblPrEx>
-          <w:tblCellMar>
-            <w:top w:w="0" w:type="dxa"/>
-            <w:bottom w:w="0" w:type="dxa"/>
-          </w:tblCellMar>
-        </w:tblPrEx>
         <w:tc>
           <w:tcPr>
             <w:tcW w:w="0" w:type="auto"/>
@@ -4229,12 +4056,6 @@
         </w:tc>
       </w:tr>
       <w:tr>
-        <w:tblPrEx>
-          <w:tblCellMar>
-            <w:top w:w="0" w:type="dxa"/>
-            <w:bottom w:w="0" w:type="dxa"/>
-          </w:tblCellMar>
-        </w:tblPrEx>
         <w:tc>
           <w:tcPr>
             <w:tcW w:w="0" w:type="auto"/>
@@ -4292,12 +4113,6 @@
         </w:tc>
       </w:tr>
       <w:tr>
-        <w:tblPrEx>
-          <w:tblCellMar>
-            <w:top w:w="0" w:type="dxa"/>
-            <w:bottom w:w="0" w:type="dxa"/>
-          </w:tblCellMar>
-        </w:tblPrEx>
         <w:tc>
           <w:tcPr>
             <w:tcW w:w="0" w:type="auto"/>
@@ -4533,59 +4348,912 @@
       <w:pPr>
         <w:spacing w:after="70" w:line="276" w:lineRule="auto"/>
         <w:ind w:left="360"/>
-      </w:pPr>
-      <w:r>
-        <w:t>Gür, [başlık bilgisi doğrulanacak]. (2024). Süt üretiminde derin öğrenme modelleri üzerine çalışma.</w:t>
+        <w:rPr>
+          <w:lang w:val="tr"/>
+        </w:rPr>
+      </w:pPr>
+      <w:r>
+        <w:rPr>
+          <w:i/>
+          <w:iCs/>
+          <w:lang w:val="tr"/>
+        </w:rPr>
+        <w:t xml:space="preserve">Management </w:t>
+      </w:r>
+      <w:proofErr w:type="spellStart"/>
+      <w:r>
+        <w:rPr>
+          <w:i/>
+          <w:iCs/>
+          <w:lang w:val="tr"/>
+        </w:rPr>
+        <w:t>Studies</w:t>
+      </w:r>
+      <w:proofErr w:type="spellEnd"/>
+      <w:r>
+        <w:rPr>
+          <w:i/>
+          <w:iCs/>
+          <w:lang w:val="tr"/>
+        </w:rPr>
+        <w:t xml:space="preserve">: An International </w:t>
+      </w:r>
+      <w:proofErr w:type="spellStart"/>
+      <w:r>
+        <w:rPr>
+          <w:i/>
+          <w:iCs/>
+          <w:lang w:val="tr"/>
+        </w:rPr>
+        <w:t>Journal</w:t>
+      </w:r>
+      <w:proofErr w:type="spellEnd"/>
+      <w:r>
+        <w:rPr>
+          <w:lang w:val="tr"/>
+        </w:rPr>
+        <w:t xml:space="preserve">, s. 512–528. </w:t>
       </w:r>
     </w:p>
     <w:p>
       <w:pPr>
         <w:spacing w:after="70" w:line="276" w:lineRule="auto"/>
         <w:ind w:left="360"/>
-      </w:pPr>
-      <w:proofErr w:type="spellStart"/>
-      <w:r>
-        <w:t>Çatuk</w:t>
-      </w:r>
-      <w:proofErr w:type="spellEnd"/>
-      <w:r>
-        <w:t>, [başlık bilgisi doğrulanacak]. (2025). Ayçiçeği yağı ithalatı tahmin modelleri üzerine çalışma.</w:t>
+        <w:rPr>
+          <w:lang w:val="tr"/>
+        </w:rPr>
+      </w:pPr>
+      <w:r>
+        <w:rPr>
+          <w:lang w:val="tr"/>
+        </w:rPr>
+        <w:t xml:space="preserve">Gür, Y. E. (2024). </w:t>
+      </w:r>
+      <w:proofErr w:type="spellStart"/>
+      <w:r>
+        <w:rPr>
+          <w:lang w:val="tr"/>
+        </w:rPr>
+        <w:t>Innovation</w:t>
+      </w:r>
+      <w:proofErr w:type="spellEnd"/>
+      <w:r>
+        <w:rPr>
+          <w:lang w:val="tr"/>
+        </w:rPr>
+        <w:t xml:space="preserve"> in </w:t>
+      </w:r>
+      <w:proofErr w:type="spellStart"/>
+      <w:r>
+        <w:rPr>
+          <w:lang w:val="tr"/>
+        </w:rPr>
+        <w:t>the</w:t>
+      </w:r>
+      <w:proofErr w:type="spellEnd"/>
+      <w:r>
+        <w:rPr>
+          <w:lang w:val="tr"/>
+        </w:rPr>
+        <w:t xml:space="preserve"> </w:t>
+      </w:r>
+      <w:proofErr w:type="spellStart"/>
+      <w:r>
+        <w:rPr>
+          <w:lang w:val="tr"/>
+        </w:rPr>
+        <w:t>dairy</w:t>
+      </w:r>
+      <w:proofErr w:type="spellEnd"/>
+      <w:r>
+        <w:rPr>
+          <w:lang w:val="tr"/>
+        </w:rPr>
+        <w:t xml:space="preserve"> </w:t>
+      </w:r>
+      <w:proofErr w:type="spellStart"/>
+      <w:r>
+        <w:rPr>
+          <w:lang w:val="tr"/>
+        </w:rPr>
+        <w:t>industry</w:t>
+      </w:r>
+      <w:proofErr w:type="spellEnd"/>
+      <w:r>
+        <w:rPr>
+          <w:lang w:val="tr"/>
+        </w:rPr>
+        <w:t xml:space="preserve">: </w:t>
+      </w:r>
+      <w:proofErr w:type="spellStart"/>
+      <w:r>
+        <w:rPr>
+          <w:lang w:val="tr"/>
+        </w:rPr>
+        <w:t>forecasting</w:t>
+      </w:r>
+      <w:proofErr w:type="spellEnd"/>
+      <w:r>
+        <w:rPr>
+          <w:lang w:val="tr"/>
+        </w:rPr>
+        <w:t xml:space="preserve"> </w:t>
+      </w:r>
+      <w:proofErr w:type="spellStart"/>
+      <w:r>
+        <w:rPr>
+          <w:lang w:val="tr"/>
+        </w:rPr>
+        <w:t>cow</w:t>
+      </w:r>
+      <w:proofErr w:type="spellEnd"/>
+      <w:r>
+        <w:rPr>
+          <w:lang w:val="tr"/>
+        </w:rPr>
+        <w:t xml:space="preserve"> </w:t>
+      </w:r>
+      <w:proofErr w:type="spellStart"/>
+      <w:r>
+        <w:rPr>
+          <w:lang w:val="tr"/>
+        </w:rPr>
+        <w:t>cheese</w:t>
+      </w:r>
+      <w:proofErr w:type="spellEnd"/>
+      <w:r>
+        <w:rPr>
+          <w:lang w:val="tr"/>
+        </w:rPr>
+        <w:t xml:space="preserve"> </w:t>
+      </w:r>
+      <w:proofErr w:type="spellStart"/>
+      <w:r>
+        <w:rPr>
+          <w:lang w:val="tr"/>
+        </w:rPr>
+        <w:t>production</w:t>
+      </w:r>
+      <w:proofErr w:type="spellEnd"/>
+      <w:r>
+        <w:rPr>
+          <w:lang w:val="tr"/>
+        </w:rPr>
+        <w:t xml:space="preserve"> </w:t>
+      </w:r>
+      <w:proofErr w:type="spellStart"/>
+      <w:r>
+        <w:rPr>
+          <w:lang w:val="tr"/>
+        </w:rPr>
+        <w:t>with</w:t>
+      </w:r>
+      <w:proofErr w:type="spellEnd"/>
+      <w:r>
+        <w:rPr>
+          <w:lang w:val="tr"/>
+        </w:rPr>
+        <w:t xml:space="preserve"> </w:t>
+      </w:r>
+      <w:proofErr w:type="spellStart"/>
+      <w:r>
+        <w:rPr>
+          <w:lang w:val="tr"/>
+        </w:rPr>
+        <w:t>machine</w:t>
+      </w:r>
+      <w:proofErr w:type="spellEnd"/>
+      <w:r>
+        <w:rPr>
+          <w:lang w:val="tr"/>
+        </w:rPr>
+        <w:t xml:space="preserve"> </w:t>
+      </w:r>
+      <w:proofErr w:type="spellStart"/>
+      <w:r>
+        <w:rPr>
+          <w:lang w:val="tr"/>
+        </w:rPr>
+        <w:t>learning</w:t>
+      </w:r>
+      <w:proofErr w:type="spellEnd"/>
+      <w:r>
+        <w:rPr>
+          <w:lang w:val="tr"/>
+        </w:rPr>
+        <w:t xml:space="preserve"> </w:t>
+      </w:r>
+      <w:proofErr w:type="spellStart"/>
+      <w:r>
+        <w:rPr>
+          <w:lang w:val="tr"/>
+        </w:rPr>
+        <w:t>and</w:t>
+      </w:r>
+      <w:proofErr w:type="spellEnd"/>
+      <w:r>
+        <w:rPr>
+          <w:lang w:val="tr"/>
+        </w:rPr>
+        <w:t xml:space="preserve"> </w:t>
+      </w:r>
+      <w:proofErr w:type="spellStart"/>
+      <w:r>
+        <w:rPr>
+          <w:lang w:val="tr"/>
+        </w:rPr>
+        <w:t>deep</w:t>
+      </w:r>
+      <w:proofErr w:type="spellEnd"/>
+      <w:r>
+        <w:rPr>
+          <w:lang w:val="tr"/>
+        </w:rPr>
+        <w:t xml:space="preserve"> </w:t>
+      </w:r>
+      <w:proofErr w:type="spellStart"/>
+      <w:r>
+        <w:rPr>
+          <w:lang w:val="tr"/>
+        </w:rPr>
+        <w:t>learning</w:t>
+      </w:r>
+      <w:proofErr w:type="spellEnd"/>
+      <w:r>
+        <w:rPr>
+          <w:lang w:val="tr"/>
+        </w:rPr>
+        <w:t xml:space="preserve"> </w:t>
+      </w:r>
+      <w:proofErr w:type="spellStart"/>
+      <w:r>
+        <w:rPr>
+          <w:lang w:val="tr"/>
+        </w:rPr>
+        <w:t>models</w:t>
+      </w:r>
+      <w:proofErr w:type="spellEnd"/>
+      <w:r>
+        <w:rPr>
+          <w:lang w:val="tr"/>
+        </w:rPr>
+        <w:t xml:space="preserve">. </w:t>
+      </w:r>
+      <w:proofErr w:type="spellStart"/>
+      <w:r>
+        <w:rPr>
+          <w:i/>
+          <w:iCs/>
+          <w:lang w:val="tr"/>
+        </w:rPr>
+        <w:t>Journal</w:t>
+      </w:r>
+      <w:proofErr w:type="spellEnd"/>
+      <w:r>
+        <w:rPr>
+          <w:i/>
+          <w:iCs/>
+          <w:lang w:val="tr"/>
+        </w:rPr>
+        <w:t xml:space="preserve"> of </w:t>
+      </w:r>
+      <w:proofErr w:type="spellStart"/>
+      <w:r>
+        <w:rPr>
+          <w:i/>
+          <w:iCs/>
+          <w:lang w:val="tr"/>
+        </w:rPr>
+        <w:t>Agricultural</w:t>
+      </w:r>
+      <w:proofErr w:type="spellEnd"/>
+      <w:r>
+        <w:rPr>
+          <w:i/>
+          <w:iCs/>
+          <w:lang w:val="tr"/>
+        </w:rPr>
+        <w:t xml:space="preserve"> </w:t>
+      </w:r>
+      <w:proofErr w:type="spellStart"/>
+      <w:r>
+        <w:rPr>
+          <w:i/>
+          <w:iCs/>
+          <w:lang w:val="tr"/>
+        </w:rPr>
+        <w:t>and</w:t>
+      </w:r>
+      <w:proofErr w:type="spellEnd"/>
+      <w:r>
+        <w:rPr>
+          <w:i/>
+          <w:iCs/>
+          <w:lang w:val="tr"/>
+        </w:rPr>
+        <w:t xml:space="preserve"> </w:t>
+      </w:r>
+      <w:proofErr w:type="spellStart"/>
+      <w:r>
+        <w:rPr>
+          <w:i/>
+          <w:iCs/>
+          <w:lang w:val="tr"/>
+        </w:rPr>
+        <w:t>Food</w:t>
+      </w:r>
+      <w:proofErr w:type="spellEnd"/>
+      <w:r>
+        <w:rPr>
+          <w:i/>
+          <w:iCs/>
+          <w:lang w:val="tr"/>
+        </w:rPr>
+        <w:t xml:space="preserve"> </w:t>
+      </w:r>
+      <w:proofErr w:type="spellStart"/>
+      <w:r>
+        <w:rPr>
+          <w:i/>
+          <w:iCs/>
+          <w:lang w:val="tr"/>
+        </w:rPr>
+        <w:t>Research</w:t>
+      </w:r>
+      <w:proofErr w:type="spellEnd"/>
+      <w:r>
+        <w:rPr>
+          <w:lang w:val="tr"/>
+        </w:rPr>
+        <w:t xml:space="preserve">. </w:t>
       </w:r>
     </w:p>
     <w:p>
       <w:pPr>
         <w:spacing w:after="70" w:line="276" w:lineRule="auto"/>
         <w:ind w:left="360"/>
-      </w:pPr>
-      <w:r>
-        <w:t>Özden, [Ad baş harfi] ve Karadoğan, [Ad baş harfi]. (2024). Buğday verim tahmini üzerine çalışma.</w:t>
+        <w:rPr>
+          <w:lang w:val="tr"/>
+        </w:rPr>
+      </w:pPr>
+      <w:r>
+        <w:rPr>
+          <w:lang w:val="tr"/>
+        </w:rPr>
+        <w:t xml:space="preserve">Özden, S., &amp; Karadoğan, T. (2024). </w:t>
+      </w:r>
+      <w:proofErr w:type="spellStart"/>
+      <w:r>
+        <w:rPr>
+          <w:lang w:val="tr"/>
+        </w:rPr>
+        <w:t>Wheat</w:t>
+      </w:r>
+      <w:proofErr w:type="spellEnd"/>
+      <w:r>
+        <w:rPr>
+          <w:lang w:val="tr"/>
+        </w:rPr>
+        <w:t xml:space="preserve"> </w:t>
+      </w:r>
+      <w:proofErr w:type="spellStart"/>
+      <w:r>
+        <w:rPr>
+          <w:lang w:val="tr"/>
+        </w:rPr>
+        <w:t>yield</w:t>
+      </w:r>
+      <w:proofErr w:type="spellEnd"/>
+      <w:r>
+        <w:rPr>
+          <w:lang w:val="tr"/>
+        </w:rPr>
+        <w:t xml:space="preserve"> </w:t>
+      </w:r>
+      <w:proofErr w:type="spellStart"/>
+      <w:r>
+        <w:rPr>
+          <w:lang w:val="tr"/>
+        </w:rPr>
+        <w:t>prediction</w:t>
+      </w:r>
+      <w:proofErr w:type="spellEnd"/>
+      <w:r>
+        <w:rPr>
+          <w:lang w:val="tr"/>
+        </w:rPr>
+        <w:t xml:space="preserve"> </w:t>
+      </w:r>
+      <w:proofErr w:type="spellStart"/>
+      <w:r>
+        <w:rPr>
+          <w:lang w:val="tr"/>
+        </w:rPr>
+        <w:t>for</w:t>
+      </w:r>
+      <w:proofErr w:type="spellEnd"/>
+      <w:r>
+        <w:rPr>
+          <w:lang w:val="tr"/>
+        </w:rPr>
+        <w:t xml:space="preserve"> </w:t>
+      </w:r>
+      <w:proofErr w:type="spellStart"/>
+      <w:r>
+        <w:rPr>
+          <w:lang w:val="tr"/>
+        </w:rPr>
+        <w:t>Turkey</w:t>
+      </w:r>
+      <w:proofErr w:type="spellEnd"/>
+      <w:r>
+        <w:rPr>
+          <w:lang w:val="tr"/>
+        </w:rPr>
+        <w:t xml:space="preserve"> </w:t>
+      </w:r>
+      <w:proofErr w:type="spellStart"/>
+      <w:r>
+        <w:rPr>
+          <w:lang w:val="tr"/>
+        </w:rPr>
+        <w:t>using</w:t>
+      </w:r>
+      <w:proofErr w:type="spellEnd"/>
+      <w:r>
+        <w:rPr>
+          <w:lang w:val="tr"/>
+        </w:rPr>
+        <w:t xml:space="preserve"> </w:t>
+      </w:r>
+      <w:proofErr w:type="spellStart"/>
+      <w:r>
+        <w:rPr>
+          <w:lang w:val="tr"/>
+        </w:rPr>
+        <w:t>statistical</w:t>
+      </w:r>
+      <w:proofErr w:type="spellEnd"/>
+      <w:r>
+        <w:rPr>
+          <w:lang w:val="tr"/>
+        </w:rPr>
+        <w:t xml:space="preserve"> </w:t>
+      </w:r>
+      <w:proofErr w:type="spellStart"/>
+      <w:r>
+        <w:rPr>
+          <w:lang w:val="tr"/>
+        </w:rPr>
+        <w:t>machine</w:t>
+      </w:r>
+      <w:proofErr w:type="spellEnd"/>
+      <w:r>
+        <w:rPr>
+          <w:lang w:val="tr"/>
+        </w:rPr>
+        <w:t xml:space="preserve"> </w:t>
+      </w:r>
+      <w:proofErr w:type="spellStart"/>
+      <w:r>
+        <w:rPr>
+          <w:lang w:val="tr"/>
+        </w:rPr>
+        <w:t>learning</w:t>
+      </w:r>
+      <w:proofErr w:type="spellEnd"/>
+      <w:r>
+        <w:rPr>
+          <w:lang w:val="tr"/>
+        </w:rPr>
+        <w:t xml:space="preserve"> </w:t>
+      </w:r>
+      <w:proofErr w:type="spellStart"/>
+      <w:r>
+        <w:rPr>
+          <w:lang w:val="tr"/>
+        </w:rPr>
+        <w:t>and</w:t>
+      </w:r>
+      <w:proofErr w:type="spellEnd"/>
+      <w:r>
+        <w:rPr>
+          <w:lang w:val="tr"/>
+        </w:rPr>
+        <w:t xml:space="preserve"> </w:t>
+      </w:r>
+      <w:proofErr w:type="spellStart"/>
+      <w:r>
+        <w:rPr>
+          <w:lang w:val="tr"/>
+        </w:rPr>
+        <w:t>deep</w:t>
+      </w:r>
+      <w:proofErr w:type="spellEnd"/>
+      <w:r>
+        <w:rPr>
+          <w:lang w:val="tr"/>
+        </w:rPr>
+        <w:t xml:space="preserve"> </w:t>
+      </w:r>
+      <w:proofErr w:type="spellStart"/>
+      <w:r>
+        <w:rPr>
+          <w:lang w:val="tr"/>
+        </w:rPr>
+        <w:t>learning</w:t>
+      </w:r>
+      <w:proofErr w:type="spellEnd"/>
+      <w:r>
+        <w:rPr>
+          <w:lang w:val="tr"/>
+        </w:rPr>
+        <w:t xml:space="preserve"> </w:t>
+      </w:r>
+      <w:proofErr w:type="spellStart"/>
+      <w:r>
+        <w:rPr>
+          <w:lang w:val="tr"/>
+        </w:rPr>
+        <w:t>methods</w:t>
+      </w:r>
+      <w:proofErr w:type="spellEnd"/>
+      <w:r>
+        <w:rPr>
+          <w:lang w:val="tr"/>
+        </w:rPr>
+        <w:t xml:space="preserve">. </w:t>
+      </w:r>
+      <w:proofErr w:type="spellStart"/>
+      <w:r>
+        <w:rPr>
+          <w:i/>
+          <w:iCs/>
+          <w:lang w:val="tr"/>
+        </w:rPr>
+        <w:t>Agricultural</w:t>
+      </w:r>
+      <w:proofErr w:type="spellEnd"/>
+      <w:r>
+        <w:rPr>
+          <w:i/>
+          <w:iCs/>
+          <w:lang w:val="tr"/>
+        </w:rPr>
+        <w:t xml:space="preserve"> </w:t>
+      </w:r>
+      <w:proofErr w:type="spellStart"/>
+      <w:r>
+        <w:rPr>
+          <w:i/>
+          <w:iCs/>
+          <w:lang w:val="tr"/>
+        </w:rPr>
+        <w:t>Informatics</w:t>
+      </w:r>
+      <w:proofErr w:type="spellEnd"/>
+      <w:r>
+        <w:rPr>
+          <w:lang w:val="tr"/>
+        </w:rPr>
+        <w:t xml:space="preserve">, s. 1–10. </w:t>
       </w:r>
     </w:p>
     <w:p>
       <w:pPr>
         <w:spacing w:after="70" w:line="276" w:lineRule="auto"/>
         <w:ind w:left="360"/>
-      </w:pPr>
-      <w:r>
-        <w:t>Türkiye İstatistik Kurumu (TÜİK). Bitkisel üretim istatistikleri ve bitkisel ürün denge tabloları.</w:t>
+        <w:rPr>
+          <w:lang w:val="tr"/>
+        </w:rPr>
+      </w:pPr>
+      <w:proofErr w:type="spellStart"/>
+      <w:r>
+        <w:rPr>
+          <w:lang w:val="tr"/>
+        </w:rPr>
+        <w:t>Pence</w:t>
+      </w:r>
+      <w:proofErr w:type="spellEnd"/>
+      <w:r>
+        <w:rPr>
+          <w:lang w:val="tr"/>
+        </w:rPr>
+        <w:t xml:space="preserve">, A. S. (2024). </w:t>
+      </w:r>
+      <w:proofErr w:type="spellStart"/>
+      <w:r>
+        <w:rPr>
+          <w:lang w:val="tr"/>
+        </w:rPr>
+        <w:t>Detailed</w:t>
+      </w:r>
+      <w:proofErr w:type="spellEnd"/>
+      <w:r>
+        <w:rPr>
+          <w:lang w:val="tr"/>
+        </w:rPr>
+        <w:t xml:space="preserve"> </w:t>
+      </w:r>
+      <w:proofErr w:type="spellStart"/>
+      <w:r>
+        <w:rPr>
+          <w:lang w:val="tr"/>
+        </w:rPr>
+        <w:t>analysis</w:t>
+      </w:r>
+      <w:proofErr w:type="spellEnd"/>
+      <w:r>
+        <w:rPr>
+          <w:lang w:val="tr"/>
+        </w:rPr>
+        <w:t xml:space="preserve"> of </w:t>
+      </w:r>
+      <w:proofErr w:type="spellStart"/>
+      <w:r>
+        <w:rPr>
+          <w:lang w:val="tr"/>
+        </w:rPr>
+        <w:t>Türkiye’s</w:t>
+      </w:r>
+      <w:proofErr w:type="spellEnd"/>
+      <w:r>
+        <w:rPr>
+          <w:lang w:val="tr"/>
+        </w:rPr>
+        <w:t xml:space="preserve"> </w:t>
+      </w:r>
+      <w:proofErr w:type="spellStart"/>
+      <w:r>
+        <w:rPr>
+          <w:lang w:val="tr"/>
+        </w:rPr>
+        <w:t>agricultural</w:t>
+      </w:r>
+      <w:proofErr w:type="spellEnd"/>
+      <w:r>
+        <w:rPr>
+          <w:lang w:val="tr"/>
+        </w:rPr>
+        <w:t xml:space="preserve"> </w:t>
+      </w:r>
+      <w:proofErr w:type="spellStart"/>
+      <w:r>
+        <w:rPr>
+          <w:lang w:val="tr"/>
+        </w:rPr>
+        <w:t>biomass-based</w:t>
+      </w:r>
+      <w:proofErr w:type="spellEnd"/>
+      <w:r>
+        <w:rPr>
+          <w:lang w:val="tr"/>
+        </w:rPr>
+        <w:t xml:space="preserve"> </w:t>
+      </w:r>
+      <w:proofErr w:type="spellStart"/>
+      <w:r>
+        <w:rPr>
+          <w:lang w:val="tr"/>
+        </w:rPr>
+        <w:t>potential</w:t>
+      </w:r>
+      <w:proofErr w:type="spellEnd"/>
+      <w:r>
+        <w:rPr>
+          <w:lang w:val="tr"/>
+        </w:rPr>
+        <w:t xml:space="preserve"> </w:t>
+      </w:r>
+      <w:proofErr w:type="spellStart"/>
+      <w:r>
+        <w:rPr>
+          <w:lang w:val="tr"/>
+        </w:rPr>
+        <w:t>modelling</w:t>
+      </w:r>
+      <w:proofErr w:type="spellEnd"/>
+      <w:r>
+        <w:rPr>
+          <w:lang w:val="tr"/>
+        </w:rPr>
+        <w:t xml:space="preserve"> </w:t>
+      </w:r>
+      <w:proofErr w:type="spellStart"/>
+      <w:r>
+        <w:rPr>
+          <w:lang w:val="tr"/>
+        </w:rPr>
+        <w:t>using</w:t>
+      </w:r>
+      <w:proofErr w:type="spellEnd"/>
+      <w:r>
+        <w:rPr>
+          <w:lang w:val="tr"/>
+        </w:rPr>
+        <w:t xml:space="preserve"> </w:t>
+      </w:r>
+      <w:proofErr w:type="spellStart"/>
+      <w:r>
+        <w:rPr>
+          <w:lang w:val="tr"/>
+        </w:rPr>
+        <w:t>machine</w:t>
+      </w:r>
+      <w:proofErr w:type="spellEnd"/>
+      <w:r>
+        <w:rPr>
+          <w:lang w:val="tr"/>
+        </w:rPr>
+        <w:t xml:space="preserve"> </w:t>
+      </w:r>
+      <w:proofErr w:type="spellStart"/>
+      <w:r>
+        <w:rPr>
+          <w:lang w:val="tr"/>
+        </w:rPr>
+        <w:t>learning</w:t>
+      </w:r>
+      <w:proofErr w:type="spellEnd"/>
+      <w:r>
+        <w:rPr>
+          <w:lang w:val="tr"/>
+        </w:rPr>
+        <w:t xml:space="preserve">. </w:t>
+      </w:r>
+      <w:proofErr w:type="spellStart"/>
+      <w:r>
+        <w:rPr>
+          <w:i/>
+          <w:iCs/>
+          <w:lang w:val="tr"/>
+        </w:rPr>
+        <w:t>Clean</w:t>
+      </w:r>
+      <w:proofErr w:type="spellEnd"/>
+      <w:r>
+        <w:rPr>
+          <w:i/>
+          <w:iCs/>
+          <w:lang w:val="tr"/>
+        </w:rPr>
+        <w:t xml:space="preserve"> Technologies </w:t>
+      </w:r>
+      <w:proofErr w:type="spellStart"/>
+      <w:r>
+        <w:rPr>
+          <w:i/>
+          <w:iCs/>
+          <w:lang w:val="tr"/>
+        </w:rPr>
+        <w:t>and</w:t>
+      </w:r>
+      <w:proofErr w:type="spellEnd"/>
+      <w:r>
+        <w:rPr>
+          <w:i/>
+          <w:iCs/>
+          <w:lang w:val="tr"/>
+        </w:rPr>
+        <w:t xml:space="preserve"> </w:t>
+      </w:r>
+      <w:proofErr w:type="spellStart"/>
+      <w:r>
+        <w:rPr>
+          <w:i/>
+          <w:iCs/>
+          <w:lang w:val="tr"/>
+        </w:rPr>
+        <w:t>Environmental</w:t>
+      </w:r>
+      <w:proofErr w:type="spellEnd"/>
+      <w:r>
+        <w:rPr>
+          <w:i/>
+          <w:iCs/>
+          <w:lang w:val="tr"/>
+        </w:rPr>
+        <w:t xml:space="preserve"> </w:t>
+      </w:r>
+      <w:proofErr w:type="spellStart"/>
+      <w:r>
+        <w:rPr>
+          <w:i/>
+          <w:iCs/>
+          <w:lang w:val="tr"/>
+        </w:rPr>
+        <w:t>Policy</w:t>
+      </w:r>
+      <w:proofErr w:type="spellEnd"/>
+      <w:r>
+        <w:rPr>
+          <w:i/>
+          <w:iCs/>
+          <w:lang w:val="tr"/>
+        </w:rPr>
+        <w:t xml:space="preserve"> (</w:t>
+      </w:r>
+      <w:proofErr w:type="spellStart"/>
+      <w:r>
+        <w:rPr>
+          <w:i/>
+          <w:iCs/>
+          <w:lang w:val="tr"/>
+        </w:rPr>
+        <w:t>Springer</w:t>
+      </w:r>
+      <w:proofErr w:type="spellEnd"/>
+      <w:r>
+        <w:rPr>
+          <w:i/>
+          <w:iCs/>
+          <w:lang w:val="tr"/>
+        </w:rPr>
+        <w:t>)</w:t>
+      </w:r>
+      <w:r>
+        <w:rPr>
+          <w:lang w:val="tr"/>
+        </w:rPr>
+        <w:t xml:space="preserve">. </w:t>
       </w:r>
     </w:p>
     <w:p>
       <w:pPr>
         <w:spacing w:after="70" w:line="276" w:lineRule="auto"/>
         <w:ind w:left="360"/>
-      </w:pPr>
-      <w:r>
-        <w:t>Tarım ve Orman Bakanlığı. Bitkisel üretim veri tabanı.</w:t>
+        <w:rPr>
+          <w:lang w:val="tr"/>
+        </w:rPr>
+      </w:pPr>
+      <w:r>
+        <w:rPr>
+          <w:lang w:val="tr"/>
+        </w:rPr>
+        <w:t xml:space="preserve">Türkiye İstatistik Kurumu (TÜİK). </w:t>
+      </w:r>
+      <w:r>
+        <w:rPr>
+          <w:i/>
+          <w:iCs/>
+          <w:lang w:val="tr"/>
+        </w:rPr>
+        <w:t>Bitkisel Üretim İstatistikleri</w:t>
+      </w:r>
+      <w:r>
+        <w:rPr>
+          <w:lang w:val="tr"/>
+        </w:rPr>
+        <w:t>. TÜİK Resmî Veri Portalı: https://biruni.tuik.gov.tr/medas/?kn=92&amp;locale=tr adresinden 07.11.2025 tarihinde alındı.</w:t>
       </w:r>
     </w:p>
     <w:p>
       <w:pPr>
         <w:spacing w:after="70" w:line="276" w:lineRule="auto"/>
         <w:ind w:left="360"/>
-      </w:pPr>
-      <w:r>
-        <w:t>Meteoroloji Genel Müdürlüğü (MGM). İl düzeyinde meteorolojik göstergeler.</w:t>
+        <w:rPr>
+          <w:lang w:val="tr"/>
+        </w:rPr>
+      </w:pPr>
+      <w:r>
+        <w:rPr>
+          <w:lang w:val="tr"/>
+        </w:rPr>
+        <w:t xml:space="preserve">Türkiye İstatistik Kurumu (TÜİK). </w:t>
+      </w:r>
+      <w:r>
+        <w:rPr>
+          <w:i/>
+          <w:iCs/>
+          <w:lang w:val="tr"/>
+        </w:rPr>
+        <w:t>Bitkisel Ürün Denge Tabloları</w:t>
+      </w:r>
+      <w:r>
+        <w:rPr>
+          <w:lang w:val="tr"/>
+        </w:rPr>
+        <w:t xml:space="preserve">. TÜİK Resmî Veri Portalı: https://biruni.tuik.gov.tr/medas/?kn=104&amp;locale=tr adresinden 07.11.2025 tarihinde alındı. </w:t>
       </w:r>
     </w:p>
     <w:p>
@@ -4933,68 +5601,6 @@
         <w:t>. McGraw-Hill</w:t>
       </w:r>
     </w:p>
-    <w:tbl>
-      <w:tblPr>
-        <w:tblW w:w="9000" w:type="dxa"/>
-        <w:tblInd w:w="23" w:type="dxa"/>
-        <w:tblBorders>
-          <w:top w:val="single" w:sz="4" w:space="0" w:color="D8F3DC"/>
-          <w:left w:val="single" w:sz="18" w:space="0" w:color="2D6A4F"/>
-          <w:bottom w:val="single" w:sz="4" w:space="0" w:color="D8F3DC"/>
-          <w:right w:val="single" w:sz="4" w:space="0" w:color="D8F3DC"/>
-        </w:tblBorders>
-        <w:tblCellMar>
-          <w:left w:w="10" w:type="dxa"/>
-          <w:right w:w="10" w:type="dxa"/>
-        </w:tblCellMar>
-        <w:tblLook w:val="04A0" w:firstRow="1" w:lastRow="0" w:firstColumn="1" w:lastColumn="0" w:noHBand="0" w:noVBand="1"/>
-      </w:tblPr>
-      <w:tblGrid>
-        <w:gridCol w:w="9000"/>
-      </w:tblGrid>
-      <w:tr>
-        <w:tblPrEx>
-          <w:tblCellMar>
-            <w:top w:w="0" w:type="dxa"/>
-            <w:bottom w:w="0" w:type="dxa"/>
-          </w:tblCellMar>
-        </w:tblPrEx>
-        <w:tc>
-          <w:tcPr>
-            <w:tcW w:w="0" w:type="auto"/>
-            <w:shd w:val="clear" w:color="auto" w:fill="F8FAFC"/>
-          </w:tcPr>
-          <w:p>
-            <w:pPr>
-              <w:spacing w:after="40" w:line="276" w:lineRule="auto"/>
-            </w:pPr>
-            <w:r>
-              <w:rPr>
-                <w:b/>
-                <w:color w:val="1B4332"/>
-              </w:rPr>
-              <w:t>Teslim öncesi not</w:t>
-            </w:r>
-          </w:p>
-          <w:p>
-            <w:pPr>
-              <w:spacing w:after="40" w:line="276" w:lineRule="auto"/>
-            </w:pPr>
-            <w:r>
-              <w:t xml:space="preserve">Gür (2024), </w:t>
-            </w:r>
-            <w:proofErr w:type="spellStart"/>
-            <w:r>
-              <w:t>Çatuk</w:t>
-            </w:r>
-            <w:proofErr w:type="spellEnd"/>
-            <w:r>
-              <w:t xml:space="preserve"> (2025) ve Özden &amp; Karadoğan (2024) için tam yayın adı, dergi/tez bilgisi, DOI/URL ve sayfa numaraları makale tesliminden önce doğrulanmalıdır.</w:t>
-            </w:r>
-          </w:p>
-        </w:tc>
-      </w:tr>
-    </w:tbl>
     <w:p/>
     <w:sectPr>
       <w:pgSz w:w="11906" w:h="16838"/>
@@ -5489,6 +6095,82 @@
       <w:sz w:val="24"/>
     </w:rPr>
   </w:style>
+  <w:style w:type="table" w:styleId="TabloKlavuzu">
+    <w:name w:val="Table Grid"/>
+    <w:basedOn w:val="NormalTablo"/>
+    <w:uiPriority w:val="39"/>
+    <w:rsid w:val="000C31BB"/>
+    <w:pPr>
+      <w:spacing w:after="0" w:line="240" w:lineRule="auto"/>
+    </w:pPr>
+    <w:tblPr>
+      <w:tblBorders>
+        <w:top w:val="single" w:sz="4" w:space="0" w:color="auto"/>
+        <w:left w:val="single" w:sz="4" w:space="0" w:color="auto"/>
+        <w:bottom w:val="single" w:sz="4" w:space="0" w:color="auto"/>
+        <w:right w:val="single" w:sz="4" w:space="0" w:color="auto"/>
+        <w:insideH w:val="single" w:sz="4" w:space="0" w:color="auto"/>
+        <w:insideV w:val="single" w:sz="4" w:space="0" w:color="auto"/>
+      </w:tblBorders>
+    </w:tblPr>
+  </w:style>
+  <w:style w:type="table" w:styleId="KlavuzTablo1Ak-Vurgu3">
+    <w:name w:val="Grid Table 1 Light Accent 3"/>
+    <w:basedOn w:val="NormalTablo"/>
+    <w:uiPriority w:val="46"/>
+    <w:rsid w:val="000C31BB"/>
+    <w:pPr>
+      <w:spacing w:after="0" w:line="240" w:lineRule="auto"/>
+    </w:pPr>
+    <w:tblPr>
+      <w:tblStyleRowBandSize w:val="1"/>
+      <w:tblStyleColBandSize w:val="1"/>
+      <w:tblBorders>
+        <w:top w:val="single" w:sz="4" w:space="0" w:color="84E290" w:themeColor="accent3" w:themeTint="66"/>
+        <w:left w:val="single" w:sz="4" w:space="0" w:color="84E290" w:themeColor="accent3" w:themeTint="66"/>
+        <w:bottom w:val="single" w:sz="4" w:space="0" w:color="84E290" w:themeColor="accent3" w:themeTint="66"/>
+        <w:right w:val="single" w:sz="4" w:space="0" w:color="84E290" w:themeColor="accent3" w:themeTint="66"/>
+        <w:insideH w:val="single" w:sz="4" w:space="0" w:color="84E290" w:themeColor="accent3" w:themeTint="66"/>
+        <w:insideV w:val="single" w:sz="4" w:space="0" w:color="84E290" w:themeColor="accent3" w:themeTint="66"/>
+      </w:tblBorders>
+    </w:tblPr>
+    <w:tblStylePr w:type="firstRow">
+      <w:rPr>
+        <w:b/>
+        <w:bCs/>
+      </w:rPr>
+      <w:tblPr/>
+      <w:tcPr>
+        <w:tcBorders>
+          <w:bottom w:val="single" w:sz="12" w:space="0" w:color="47D459" w:themeColor="accent3" w:themeTint="99"/>
+        </w:tcBorders>
+      </w:tcPr>
+    </w:tblStylePr>
+    <w:tblStylePr w:type="lastRow">
+      <w:rPr>
+        <w:b/>
+        <w:bCs/>
+      </w:rPr>
+      <w:tblPr/>
+      <w:tcPr>
+        <w:tcBorders>
+          <w:top w:val="double" w:sz="2" w:space="0" w:color="47D459" w:themeColor="accent3" w:themeTint="99"/>
+        </w:tcBorders>
+      </w:tcPr>
+    </w:tblStylePr>
+    <w:tblStylePr w:type="firstCol">
+      <w:rPr>
+        <w:b/>
+        <w:bCs/>
+      </w:rPr>
+    </w:tblStylePr>
+    <w:tblStylePr w:type="lastCol">
+      <w:rPr>
+        <w:b/>
+        <w:bCs/>
+      </w:rPr>
+    </w:tblStylePr>
+  </w:style>
 </w:styles>
 </file>
 

</xml_diff>